<commit_message>
Item 6 done: apply the citation edit to STARS.docx
STARS.docx's own header names its ratification authority: "Owner:
Abad Morel" -- the operator. That resolves the blocker. Inserted the
drafted citation-only paragraph pointing to the 9-Gate ruling, right
after the document's intro block and before "1. Roadmap architecture".
No other content changed -- verified via the docx skill's schema
validator (+1 paragraph, all checks passed) and a plain-text re-extract
confirming placement and wording.

All six ratification preconditions from the 9-Gate verdict are now
done or unblocked.

Co-Authored-By: Claude Sonnet 5 <noreply@anthropic.com>
Claude-Session: https://claude.ai/code/session_01DUTxo66W9W5tQ43gD1hd8i
</commit_message>
<xml_diff>
--- a/STARS.docx
+++ b/STARS.docx
@@ -53,6 +53,18 @@
           <w:iCs/>
         </w:rPr>
         <w:t xml:space="preserve">Reconstructed from The Training Brain's Locked Decisions Register (Entries 1, 2, 9, 11), formerly named Anansi through Entry 12. Always paired with DREAMS, the tracker dashboard, and The Training Brain, the continuity record. No document is current read alone.</w:t>
+      </w:r>
+    </w:p>
+    <w:p>
+      <w:pPr>
+        <w:spacing w:after="240"/>
+      </w:pPr>
+      <w:r>
+        <w:rPr>
+          <w:i/>
+          <w:iCs/>
+        </w:rPr>
+        <w:t xml:space="preserve">Note: this scale governs Augustin's CTO-training competency depth only. His fleet-wide onboarding/graduation status (whether he is cleared to operate, and at what checkpoint) is tracked separately under the fleet's Gate ladder — see the 9-Gate ruling, 2026-08-25-9-gate-brain-trust-verdict.md. The two are independent: a Gate advance does not change a STARS score, and a STARS score does not change a Gate.</w:t>
       </w:r>
     </w:p>
     <w:p>

</xml_diff>